<commit_message>
Update routing slip template signature section.
Remove the date and time placeholders from the RD approval area so generated documents no longer auto-fill that field.

Co-authored-by: Cursor <cursoragent@cursor.com>
</commit_message>
<xml_diff>
--- a/templates/document-template.docx
+++ b/templates/document-template.docx
@@ -1074,24 +1074,6 @@
                 <w:szCs w:val="20"/>
               </w:rPr>
             </w:pPr>
-            <w:r>
-              <w:rPr>
-                <w:rFonts w:ascii="Arial" w:eastAsia="Times New Roman" w:hAnsi="Arial" w:cs="Arial"/>
-                <w:color w:val="000000"/>
-                <w:sz w:val="20"/>
-                <w:szCs w:val="20"/>
-              </w:rPr>
-              <w:t>{date}</w:t>
-            </w:r>
-            <w:r>
-              <w:rPr>
-                <w:rFonts w:ascii="Arial" w:eastAsia="Times New Roman" w:hAnsi="Arial" w:cs="Arial"/>
-                <w:color w:val="000000"/>
-                <w:sz w:val="20"/>
-                <w:szCs w:val="20"/>
-              </w:rPr>
-              <w:t xml:space="preserve"> {time}</w:t>
-            </w:r>
           </w:p>
         </w:tc>
         <w:tc>
@@ -4738,7 +4720,7 @@
               </w:rPr>
             </w:pPr>
           </w:p>
-          <w:p w14:paraId="OCRSQR" w14:textId="OCRSQR">
+          <w:p>
             <w:pPr>
               <w:spacing w:after="80" w:line="240" w:lineRule="auto"/>
               <w:jc w:val="right"/>
@@ -4759,7 +4741,7 @@
               <w:t>{%qrCode}</w:t>
             </w:r>
           </w:p>
-          <w:p w14:paraId="OCRSREF" w14:textId="OCRSREF">
+          <w:p>
             <w:pPr>
               <w:spacing w:after="0" w:line="240" w:lineRule="auto"/>
               <w:jc w:val="right"/>

</xml_diff>

<commit_message>
Stop requiring date and time placeholders in Word template.
Date and time remain on the submit form and in the database, but are no longer printed on the routing slip after the template change.

Co-authored-by: Cursor <cursoragent@cursor.com>
</commit_message>
<xml_diff>
--- a/templates/document-template.docx
+++ b/templates/document-template.docx
@@ -4720,7 +4720,7 @@
               </w:rPr>
             </w:pPr>
           </w:p>
-          <w:p>
+          <w:p w14:paraId="OCRSQR" w14:textId="OCRSQR">
             <w:pPr>
               <w:spacing w:after="80" w:line="240" w:lineRule="auto"/>
               <w:jc w:val="right"/>
@@ -4741,7 +4741,7 @@
               <w:t>{%qrCode}</w:t>
             </w:r>
           </w:p>
-          <w:p>
+          <w:p w14:paraId="OCRSREF" w14:textId="OCRSREF">
             <w:pPr>
               <w:spacing w:after="0" w:line="240" w:lineRule="auto"/>
               <w:jc w:val="right"/>

</xml_diff>